<commit_message>
Add documented rice criticism/restriction: Valencia sanitary limits + 'Muslim food' stigma (S21-S26, P11-P13)
Co-Authored-By: Tatsuki Onishi <bougtoir@gmail.com>
</commit_message>
<xml_diff>
--- a/outputs/RESEARCH_FEASIBILITY_REPORT.docx
+++ b/outputs/RESEARCH_FEASIBILITY_REPORT.docx
@@ -408,7 +408,7 @@
         <w:pStyle w:val="ListBullet"/>
       </w:pPr>
       <w:r>
-        <w:t>H3 — Rejected: no document restricts rice; the two recorded interventions (Valencia water-law continuity; Sforza promotion + export monopoly) are pro-cultivation.</w:t>
+        <w:t>H3 — Qualified: restriction IS documented — Valencia limited/prohibited marsh-zone paddies for sanitary reasons ('fiebres tercianas', post-1238 onward, intermittent through the 18th c.) plus confessional 'Muslim food' stigma; but no document anywhere restricts rice to preserve peasant dependence. The 1475 Milan intervention was promotion + export monopoly.</w:t>
       </w:r>
     </w:p>
     <w:p>
@@ -429,7 +429,7 @@
     </w:p>
     <w:p>
       <w:r>
-        <w:t>A defensible mechanism for when landlords *would* prefer lower output could not be constructed: the political benefit of preserved dependence would have to exceed the economic benefit of higher rent — and every observed lord behaved as the economic theory predicts. See POLITICAL_INTENT_EVIDENCE.csv and COMPETING_EXPLANATIONS.md.</w:t>
+        <w:t>A defensible mechanism for when landlords *would* prefer lower output could not be constructed: the political benefit of preserved dependence would have to exceed the economic benefit of higher rent — and every observed lord behaved as the economic theory predicts. The genuine medieval criticisms of rice (wetland fevers; 'Muslim food' stigma — the closest analogue to the potato's later 'devil's root' reputation) are sanitary and confessional, not dependence-motivated. See POLITICAL_INTENT_EVIDENCE.csv and COMPETING_EXPLANATIONS.md.</w:t>
       </w:r>
     </w:p>
     <w:p>

</xml_diff>